<commit_message>
temp_aging: strip the table style that drew the rule in the wrong place
Root cause of the rule appearing under the superheader instead of under the
column headers: pandoc's reference.docx defines a Table style containing

  <w:tblStylePr w:type="firstRow">
    <w:tcBorders><w:bottom w:val="single"/></w:tcBorders>
  </w:tblStylePr>

so Word draws a full-width line under row 1 whatever it contains. In a table
with a superheader, row 1 is the superheader. Removed from reference.docx, so
the explicit cell borders are the only source of rules.

Intended structure, for the record: full-width heavy rule at top; group rule
under the superheader spanning only the columns it modifies; full-width rule
under the column headers; full-width heavy rule at the bottom; no verticals.
</commit_message>
<xml_diff>
--- a/temp_aging/reference.docx
+++ b/temp_aging/reference.docx
@@ -1030,14 +1030,6 @@
         <w:right w:w="108" w:type="dxa"/>
       </w:tblCellMar>
     </w:tblPr>
-    <w:tblStylePr w:type="firstRow">
-      <w:tcPr>
-        <w:tcBorders>
-          <w:bottom w:val="single"/>
-        </w:tcBorders>
-        <w:vAlign w:val="bottom"/>
-      </w:tcPr>
-    </w:tblStylePr>
   </w:style>
   <w:style w:type="paragraph" w:customStyle="1" w:styleId="DefinitionTerm">
     <w:name w:val="Definition Term"/>

</xml_diff>